<commit_message>
some reviewer comments addressed
</commit_message>
<xml_diff>
--- a/_manuscript/index.docx
+++ b/_manuscript/index.docx
@@ -55,7 +55,7 @@
         <w:pStyle w:val="Abstract"/>
       </w:pPr>
       <w:r>
-        <w:t xml:space="preserve">Alcohol Use Disorder (AUD) is a chronic, relapsing disease. An automated recovery support system using personal sensing and machine learning may help identify when individuals are at elevated lapse risk. Cellular communication sensing may detect dynamic changes in lapse risk and can be contextualized with self-reported, risk-relevant information about contacts. We evaluated a machine learning model predicting next-day alcohol lapse among individuals in early recovery from AUD using contextualized cellular communication data and baseline demographic and AUD characteristics. A total of 144 participants (49% male; mean age=40; 87% non-Hispanic White) with a goal of abstinence provided cellular communication data and alcohol use reports via a 4x daily EMA for up to three months. Models were trained and evaluated using repeated k-fold cross-validation. The best-performing model used an elastic net algorithm and retained 13 features (median posterior auROC=0.68, 95% Bayesian credible interval (CI; [0.64, 0.71]). A baseline comparison model including only baseline features retained five features and demonstrated nearly identical performance (median auROC=0.68, 95% CI [0.64, 0.71]). Cellular communication data capture some risk-relevant signal for alcohol lapse but do not provide incremental predictive value beyond baseline measures. Several communication features were retained in the final model with moderately sized coefficients, suggesting that aspects of social communication may be important for understanding lapse risk. Although, limitations inherent to cellular communication as a sensing method may outweigh their added value.</w:t>
+        <w:t xml:space="preserve">Alcohol Use Disorder (AUD) is a chronic, relapsing disease. An automated recovery support system using personal sensing and machine learning may help identify when individuals are at elevated lapse risk. Cellular communication sensing may detect dynamic changes in lapse risk and can be contextualized with self-reported, risk-relevant information about contacts. We evaluated a machine learning model predicting next-day alcohol lapse among individuals in early recovery from AUD using contextualized cellular communication data and baseline alcohol use, demographic, and psychiatric and personality characteristics. A total of 144 participants (49% male; mean age=40; 87% non-Hispanic White) with a goal of abstinence provided cellular communication data and alcohol use reports via a 4x daily EMA for up to three months. Models were trained and evaluated using repeated k-fold cross-validation. The best-performing full model used an elastic net algorithm and retained 10 features (median posterior auROC=0.67, 95% Bayesian credible interval (CI; [0.64, 0.71]). A comparison model including only baseline features demonstrated comparable performance (median auROC=0.69, 95% CI [0.65, 0.72]). Cellular communication features on their own performed poorly, but still above chance performance (median auROC=0.59, 95% CI [0.55, 0.62]). These findings demonstrate that cellular communication data capture some risk-relevant signal for alcohol lapse but do not provide incremental predictive value beyond baseline measures. Several communication features were retained in the final model with moderately sized coefficients, suggesting that aspects of social communication may be important for understanding lapse risk. Although, limitations inherent to cellular communication as a sensing method may outweigh their added value.</w:t>
       </w:r>
     </w:p>
     <w:p>
@@ -3278,7 +3278,7 @@
                     <w:t xml:space="preserve"> </w:t>
                   </w:r>
                   <w:r>
-                    <w:t xml:space="preserve">Cellular communication features were scored over six feature scoring epochs (6, 12, 24, 48, 72, and 168 hours before the start of the prediction window). Within each feature scoring epoch we calculated two types of features: raw and difference features. Raw features represent the raw feature value calculated within a scoring epoch (e.g., the rate count of text messages during the 48 hours immediately preceding the start of the prediction window). Difference features capture participant-level changes from their baseline scores (e.g., the participant’s average rate count of text messages across all time on study subtracted from the rate count in the preceding 48 hours).</w:t>
+                    <w:t xml:space="preserve">Cellular communication features were scored over two feature scoring epochs (24 and 168 hours before the start of the prediction window). Within each feature scoring epoch we calculated two types of features: raw and difference features. Raw features represent the raw feature value calculated within a scoring epoch (e.g., the rate count of text messages during the 24 hours immediately preceding the start of the prediction window). Difference features capture participant-level changes from their baseline scores (e.g., the participant’s average rate count of text messages across all time on study subtracted from the rate count in the preceding 24 hours).</w:t>
                   </w:r>
                 </w:p>
               </w:tc>
@@ -3334,7 +3334,7 @@
               <w:pStyle w:val="ImageCaption"/>
             </w:pPr>
             <w:r>
-              <w:t xml:space="preserve">Table 1: Raw Predictors, Response Options, Feature Engineering Methods, Feature Scoring Epochs, Total Number of Features, and Indication of Inclusion in Full and Baseline Models</w:t>
+              <w:t xml:space="preserve">Table 1: Raw Predictors, Response Options, Feature Engineering Methods, Feature Scoring Epochs and Total Number of Features for each feature set.</w:t>
             </w:r>
           </w:p>
           <w:bookmarkEnd w:id="17"/>
@@ -3416,7 +3416,10 @@
         <w:pStyle w:val="FirstParagraph"/>
       </w:pPr>
       <w:r>
-        <w:t xml:space="preserve">We evaluated model performance with a Bayesian hierarchical generalized linear model. Posterior distributions with 95% credible intervals (CI) were estimated from the 30 held-out folds using weakly informative, data-dependent priors to regularize and reduce overfitting: Residual SD ~ normal(0, exp(2)); intercept (centered predictors) ~ normal(2.3, 1.3); window-width contrasts ~ normal(0, 2.69); covariance ~ decov(1,1,1,1). Random intercepts were included for repeat and fold (nested within repeat). auROCs were logit-transformed and regressed on model type to estimate the probability that model performances differed systematically.</w:t>
+        <w:t xml:space="preserve">We evaluated model performance for our three final models (full model, baseline model, cellular communication model) using a Bayesian hierarchical generalized linear model. Posterior distributions with 95% credible intervals (CI) were estimated from the 30 held-out folds using weakly informative, data-dependent priors to regularize and reduce overfitting: Residual SD ~ normal(0, exp(2)); intercept (centered predictors) ~ normal(2.3, 1.3); window-width contrasts ~ normal(0, 2.69); covariance ~ decov(1,1,1,1). Random intercepts were included for repeat and fold (nested within repeat). auROCs were logit-transformed and regressed on model type to estimate the probability that model performances differed systematically.</w:t>
+      </w:r>
+      <w:r>
+        <w:t xml:space="preserve"> </w:t>
       </w:r>
     </w:p>
     <w:p>
@@ -3424,7 +3427,7 @@
         <w:pStyle w:val="BodyText"/>
       </w:pPr>
       <w:r>
-        <w:t xml:space="preserve">The best performing model used an elastic net algorithm. This model was refit on the entire data set to identify the most important features. We quantified feature importance by examining the retained features (i.e., coefficient value &gt; 0) in the full model and ordering them by absolute coefficient value. These values provide an estimate of the direction and magnitude of association between each predictor and the outcome, conditional on the other features retained.</w:t>
+        <w:t xml:space="preserve">We refit our full and cellular communication model on the entire data set to identify the most important features. We quantified feature importance by examining the retained features (i.e., coefficient value &gt; 0) in our final elastic net model and ordering them by absolute coefficient value. These values provide an estimate of the direction and magnitude of association between each predictor and the outcome, conditional on the other features retained. We plotted coefficients for both models to visualize whether descriptive differences in retained cellular communication features existed when controlling for other baseline features compared to not controlling for baseline features.</w:t>
       </w:r>
     </w:p>
     <w:bookmarkEnd w:id="21"/>

</xml_diff>

<commit_message>
last updates before passing to John
</commit_message>
<xml_diff>
--- a/_manuscript/index.docx
+++ b/_manuscript/index.docx
@@ -39,7 +39,7 @@
         <w:pStyle w:val="Date"/>
       </w:pPr>
       <w:r>
-        <w:t xml:space="preserve">2026-04-20</w:t>
+        <w:t xml:space="preserve">2026-04-22</w:t>
       </w:r>
     </w:p>
     <w:p>
@@ -568,7 +568,7 @@
         </w:numPr>
       </w:pPr>
       <w:r>
-        <w:t xml:space="preserve">Within each feature scoring epoch, we calculated two types of features: raw and difference features. Raw features represent the feature value calculated within a given feature scoring epoch. For example, the raw rate of incoming text messages in a 24-hour feature scoring epoch was calculated as the total number of incoming text messages in the 24 hours immediately preceding the start of the prediction window, divided by 24. Difference features capture participant-level changes from baseline. Specifically, for each feature we subtracted the participant’s mean value (using all available data prior to the prediction window) from the associated raw feature value. For example, the difference feature for incoming text messages was calculated as the raw incoming text message rate minus the participant’s average incoming text message rate across all time on study.</w:t>
+        <w:t xml:space="preserve">Within each feature scoring epoch, we calculated two types of features: raw and difference features. Raw features represent the feature value calculated within a given feature scoring epoch. For example, the raw rate of incoming text messages in a 24-hour feature scoring epoch was calculated as the total number of incoming text messages in the 24 hours immediately preceding the start of the prediction window, divided by 24. Difference features capture participant-level changes from baseline. In other words, how does this feature value differ from what is typical for this person? Difference features were scored by subtracting the participant’s mean value (using all available data prior to the prediction window) from the associated raw feature value. For example, the difference feature for incoming text messages was calculated as the raw incoming text message rate minus the participant’s average incoming text message rate across all time on study.</w:t>
       </w:r>
     </w:p>
     <w:p>
@@ -6366,7 +6366,7 @@
             <w:r>
               <w:drawing>
                 <wp:inline>
-                  <wp:extent cx="5334000" cy="3333749"/>
+                  <wp:extent cx="5334000" cy="4445000"/>
                   <wp:effectExtent b="0" l="0" r="0" t="0"/>
                   <wp:docPr descr="" title="" id="28" name="Picture"/>
                   <a:graphic>
@@ -6387,7 +6387,7 @@
                         <pic:spPr bwMode="auto">
                           <a:xfrm>
                             <a:off x="0" y="0"/>
-                            <a:ext cx="5334000" cy="3333749"/>
+                            <a:ext cx="5334000" cy="4445000"/>
                           </a:xfrm>
                           <a:prstGeom prst="rect">
                             <a:avLst/>
@@ -6465,7 +6465,7 @@
         <w:pStyle w:val="FirstParagraph"/>
       </w:pPr>
       <w:r>
-        <w:t xml:space="preserve">Our model achieved fair performance, with an auROC of 0.67, indicating that some predictive signal was present. However, it did not offer incremental value beyond a baseline model that included only baseline self-report measures. Consistent with this, the four most important predictors in our model were all self-report variables: abstinence confidence, abstinence goal, negative affect efficacy, and craving.</w:t>
+        <w:t xml:space="preserve">Our full model achieved fair performance, with an auROC of 0.67, indicating that some predictive signal was present. However, it did not offer incremental value beyond a baseline model that included only baseline self-report measures. Consistent with this, the four most important predictors in our model were all self-report variables: abstinence confidence, abstinence goal, negative affect efficacy, and craving.</w:t>
       </w:r>
     </w:p>
     <w:p>
@@ -6473,7 +6473,7 @@
         <w:pStyle w:val="BodyText"/>
       </w:pPr>
       <w:r>
-        <w:t xml:space="preserve">Nonetheless, several communication features were retained in the final model with moderately sized coefficients. These included communications with people unaware of the participant’s recovery status, non-drinkers, friends, and individuals who were unpleasant to interact with. In contrast, raw counts of calls and text messages and call durations were not retained in the final model. This implies that the quantity of communication may be less informative than the quality and social significance. Future research may benefit from collecting richer contextual data about communication contacts to better understand the social dynamics contributing to lapse risk.</w:t>
+        <w:t xml:space="preserve">Cellular communication data on its own performed poorly for prediction (auROC = 0.67) However, it still performed above what we would expect from a model performing at chance, suggesting there may be some signal in this data. Additionally, several communication features were retained in the final model with moderately sized coefficients. These included communications with drinkers, non-drinkers, friends, and people unaware of the participant’s recovery goals. Number of unique contacts was also retained in the model, though with a much smaller coefficient.</w:t>
       </w:r>
     </w:p>
     <w:p>
@@ -6481,6 +6481,39 @@
         <w:pStyle w:val="BodyText"/>
       </w:pPr>
       <w:r>
+        <w:t xml:space="preserve">The finding that communications with drinkers increase lapse risk and communications with non-drinkers decrease lapse risk is consistent with prior literature</w:t>
+      </w:r>
+      <w:r>
+        <w:t xml:space="preserve"> </w:t>
+      </w:r>
+      <w:r>
+        <w:t xml:space="preserve">[19,20]</w:t>
+      </w:r>
+      <w:r>
+        <w:t xml:space="preserve">. Individuals who surround themselves with people who drink (and who may have even drunk with the individual in the past) may be more likely to experience exposure to drinking-related cues and opportunities to drink. Conversely, communicating with non-drinkers may reflect a more supportive social environment that promotes recovery. Additionally, given that alcohol use is often a social activity, it is not unexpected that increased communication with friends was associated with greater lapse risk.</w:t>
+      </w:r>
+    </w:p>
+    <w:p>
+      <w:pPr>
+        <w:pStyle w:val="BodyText"/>
+      </w:pPr>
+      <w:r>
+        <w:t xml:space="preserve">We were surprised to find that communications with people who did not know about an individual’s recovery goals was also a risk factor. We might have expected that communication with people supportive of recovery goals would be a protective factor, or that communication with people unsupportive of those goals would increase risk. One possible explanation is that lack of disclosure reflects lower confidence in sharing something as personal as recovery with others. It could also reflect perceived or anticipated stigma, thereby capturing the other person’s beliefs or attitudes about substance use. Lastly, it could signal reduced access to recovery support, as individuals cannot provide support for goals they are unaware of. Future research could explore this finding further to better understand the mechanisms underlying this association.</w:t>
+      </w:r>
+    </w:p>
+    <w:p>
+      <w:pPr>
+        <w:pStyle w:val="BodyText"/>
+      </w:pPr>
+      <w:r>
+        <w:t xml:space="preserve">In contrast to the contextual features, raw counts of calls and text messages and call durations were not retained in the final model. This implies that the quantity of communication may be less informative than the quality and social significance. Future research may benefit from collecting richer contextual data about communication contacts to better understand the social dynamics contributing to lapse risk.</w:t>
+      </w:r>
+    </w:p>
+    <w:p>
+      <w:pPr>
+        <w:pStyle w:val="BodyText"/>
+      </w:pPr>
+      <w:r>
         <w:t xml:space="preserve">Even with highly contextualized communication data, however, prediction may be limited by data sparsity. Many participants had few daily communications, and some had extended periods with no recorded interactions at all. Our study design may have further contributed to this limitation. We collected only phone and SMS text communications through the native smartphone app. In recent years, many individuals use private messaging apps (e.g., WhatsApp, Signal) or social media platforms (e.g., Facebook Messenger, Instagram) as their primary communication method</w:t>
       </w:r>
       <w:r>
@@ -6490,7 +6523,7 @@
         <w:t xml:space="preserve">[41]</w:t>
       </w:r>
       <w:r>
-        <w:t xml:space="preserve">. Therefore, our dataset likely missed a substantial portion of participants’ communications. Future studies could explore whether incorporating communication data from additional platforms yields stronger predictive signal. However, even with improved data collection methods, sparsity may remain a challenge, as some people may simply not communicate frequently with others and others use services (e.g., Snapchat) that automatically delete messages.</w:t>
+        <w:t xml:space="preserve">. Therefore, our dataset likely missed a substantial portion of participants’ communications. Future studies could explore whether incorporating communication data from additional platforms yields stronger predictive signal. It may be also worthwhile to use scoring epochs longer than one week. Longer scoring epochs (e.g., two weeks or one month) would contain more data. Additionally, they may better capture slow evolving risk-features, such as a gradually shrinking social circle leading to improved predictive performance. However, even with improved data collection methods, sparsity may remain a challenge, as some people may simply not communicate frequently with others and others use services (e.g., Snapchat) that automatically delete messages.</w:t>
       </w:r>
     </w:p>
     <w:p>
@@ -6498,13 +6531,55 @@
         <w:pStyle w:val="BodyText"/>
       </w:pPr>
       <w:r>
+        <w:t xml:space="preserve">We also cannot eliminate the possibility that our participants were purposefully deleting text messages and call logs that they did not want us to see. This may be especially relevant for text messages (e.g., where drinking plans were made). Although the focus of this study was on the metadata and context of cellular communications, text message content, nevertheless, was collected during the cellular communication log download as party of the larger aims of the parent project. This raises the possibility of missed opportunity for risk-relevant signal due to non-random patterns of missing data (i.e., data missingness increases when participants lapse).</w:t>
+      </w:r>
+    </w:p>
+    <w:p>
+      <w:pPr>
+        <w:pStyle w:val="BodyText"/>
+      </w:pPr>
+      <w:r>
+        <w:t xml:space="preserve">Our conclusions are limited by sample composition and size. Our participants were predominantly non-Hispanic White and all were from the Madison, WI area. We had poor representation of older adults (65+ years) which may have been due to our requirement that participants owned and used a smartphone. Smartphone ownership is generally high. As of 2025, roughly 91% of Americans own a smartphone, with at least 85% ownership across across gender, race/ethnicity, socioeconomic status, and geographic location subgroups</w:t>
+      </w:r>
+      <w:r>
+        <w:t xml:space="preserve"> </w:t>
+      </w:r>
+      <w:r>
+        <w:t xml:space="preserve">[42]</w:t>
+      </w:r>
+      <w:r>
+        <w:t xml:space="preserve">. One exception to this pattern is with older adults. Ownership rates dip down to 78% among those ages 65 and older</w:t>
+      </w:r>
+      <w:r>
+        <w:t xml:space="preserve"> </w:t>
+      </w:r>
+      <w:r>
+        <w:t xml:space="preserve">[42]</w:t>
+      </w:r>
+      <w:r>
+        <w:t xml:space="preserve">. On top of a relatively homogeneous sample composition, our sample size was relatively small (</w:t>
+      </w:r>
+      <m:oMath>
+        <m:r>
+          <m:t>N</m:t>
+        </m:r>
+      </m:oMath>
+      <w:r>
+        <w:t xml:space="preserve">=144). Our large number of observations (i.e., 11,507 prediction windows across participants) was sufficient for training machine learning models with low bias and variance and evaluating model performance on new individuals. However, these estimates represent unbiased estimated of how well our model performs on new individuals similar in composition to those in our sample. Thus, our findings may not generalize to individuals from more diverse populations or in different geographic locations.</w:t>
+      </w:r>
+    </w:p>
+    <w:p>
+      <w:pPr>
+        <w:pStyle w:val="BodyText"/>
+      </w:pPr>
+      <w:r>
         <w:t xml:space="preserve">We cannot entirely dismiss the potential value of cellular communication data for risk prediction. For example, researchers have successfully incorporated communication data into models with other sensing data (e.g., accelerometer, geolocation, and device usage) to detect current</w:t>
       </w:r>
       <w:r>
         <w:t xml:space="preserve"> </w:t>
       </w:r>
       <w:r>
-        <w:t xml:space="preserve">[42]</w:t>
+        <w:t xml:space="preserve">[43]</w:t>
       </w:r>
       <w:r>
         <w:t xml:space="preserve"> </w:t>
@@ -6516,13 +6591,13 @@
         <w:t xml:space="preserve"> </w:t>
       </w:r>
       <w:r>
-        <w:t xml:space="preserve">[43]</w:t>
-      </w:r>
-      <w:r>
-        <w:t xml:space="preserve"> </w:t>
-      </w:r>
-      <w:r>
-        <w:t xml:space="preserve">heavy drinking episondes in non-treatment seeking young adult populations. It is possible that in certain populations cellular communications may hold more signal. Young adults may have more frequent communication reducing sparsity concerns. Additionally, non-treatment seeking populations may be less likely to sensor their data (i.e., deleting communications) when the drinking behavior is not at odds with their goals and/or values. However, even in these instances, the unique contribution of cellular communications beyond other sensing methods is unclear. Some communication features, such as outgoing call duration and the number of outgoing calls emerged in the top 20 important features for detecting current drinking episodes. Conversely, when predicting future drinking episodes, no communication features appeared in the top 20. Other sensing methods, like geolocation and accelerometer data, appeared to be more robustly important for both detection and prediction.</w:t>
+        <w:t xml:space="preserve">[44]</w:t>
+      </w:r>
+      <w:r>
+        <w:t xml:space="preserve"> </w:t>
+      </w:r>
+      <w:r>
+        <w:t xml:space="preserve">heavy drinking episodes in non-treatment seeking young adult populations. It is possible that in certain populations cellular communications may hold more signal. Young adults may have more frequent communication reducing sparsity concerns. Additionally, non-treatment seeking populations may be less likely to sensor their data (i.e., deleting communications) when the drinking behavior is not at odds with their goals and/or values. However, even in these instances, the unique contribution of cellular communications beyond other sensing methods is unclear. Some communication features, such as outgoing call duration and the number of outgoing calls emerged in the top 20 important features for detecting current drinking episodes. Conversely, when predicting future drinking episodes, no communication features appeared in the top 20. Other sensing methods, like geolocation and accelerometer data, appeared to be more robustly important for both detection and prediction.</w:t>
       </w:r>
     </w:p>
     <w:p>
@@ -6640,7 +6715,7 @@
       </w:r>
     </w:p>
     <w:bookmarkEnd w:id="39"/>
-    <w:bookmarkStart w:id="119" w:name="references"/>
+    <w:bookmarkStart w:id="120" w:name="references"/>
     <w:p>
       <w:pPr>
         <w:pStyle w:val="Heading1"/>
@@ -6649,7 +6724,7 @@
         <w:t xml:space="preserve">References</w:t>
       </w:r>
     </w:p>
-    <w:bookmarkStart w:id="118" w:name="refs"/>
+    <w:bookmarkStart w:id="119" w:name="refs"/>
     <w:bookmarkStart w:id="41" w:name="ref-mclellanDrugDependenceChronic2000"/>
     <w:p>
       <w:pPr>
@@ -8665,7 +8740,7 @@
       </w:hyperlink>
     </w:p>
     <w:bookmarkEnd w:id="113"/>
-    <w:bookmarkStart w:id="115" w:name="ref-baeDetectingDrinkingEpisodes2017"/>
+    <w:bookmarkStart w:id="114" w:name="X6b0a2573c103b7c3d317f500c95e16aefc26ebb"/>
     <w:p>
       <w:pPr>
         <w:pStyle w:val="Bibliography"/>
@@ -8680,6 +8755,61 @@
         <w:t xml:space="preserve">	</w:t>
       </w:r>
       <w:r>
+        <w:t xml:space="preserve">Pew Research Center N. Demographics of</w:t>
+      </w:r>
+      <w:r>
+        <w:t xml:space="preserve"> </w:t>
+      </w:r>
+      <w:r>
+        <w:t xml:space="preserve">Mobile Device Ownership</w:t>
+      </w:r>
+      <w:r>
+        <w:t xml:space="preserve"> </w:t>
+      </w:r>
+      <w:r>
+        <w:t xml:space="preserve">and</w:t>
+      </w:r>
+      <w:r>
+        <w:t xml:space="preserve"> </w:t>
+      </w:r>
+      <w:r>
+        <w:t xml:space="preserve">Adoption</w:t>
+      </w:r>
+      <w:r>
+        <w:t xml:space="preserve"> </w:t>
+      </w:r>
+      <w:r>
+        <w:t xml:space="preserve">in the</w:t>
+      </w:r>
+      <w:r>
+        <w:t xml:space="preserve"> </w:t>
+      </w:r>
+      <w:r>
+        <w:t xml:space="preserve">United States</w:t>
+      </w:r>
+      <w:r>
+        <w:t xml:space="preserve">. Pew Research Center. 2025.</w:t>
+      </w:r>
+      <w:r>
+        <w:t xml:space="preserve"> </w:t>
+      </w:r>
+    </w:p>
+    <w:bookmarkEnd w:id="114"/>
+    <w:bookmarkStart w:id="116" w:name="ref-baeDetectingDrinkingEpisodes2017"/>
+    <w:p>
+      <w:pPr>
+        <w:pStyle w:val="Bibliography"/>
+      </w:pPr>
+      <w:r>
+        <w:t xml:space="preserve">43.</w:t>
+      </w:r>
+      <w:r>
+        <w:t xml:space="preserve"> </w:t>
+      </w:r>
+      <w:r>
+        <w:t xml:space="preserve">	</w:t>
+      </w:r>
+      <w:r>
         <w:t xml:space="preserve">Bae S, Ferreira D, Suffoletto B, Puyana JC, Kurtz R, Chung T, et al. Detecting</w:t>
       </w:r>
       <w:r>
@@ -8703,7 +8833,7 @@
       <w:r>
         <w:t xml:space="preserve">. Proceedings of the ACM on Interactive, Mobile, Wearable and Ubiquitous Technologies. 2017;1: 1–36. doi:</w:t>
       </w:r>
-      <w:hyperlink r:id="rId114">
+      <w:hyperlink r:id="rId115">
         <w:r>
           <w:rPr>
             <w:rStyle w:val="Hyperlink"/>
@@ -8712,14 +8842,14 @@
         </w:r>
       </w:hyperlink>
     </w:p>
-    <w:bookmarkEnd w:id="115"/>
-    <w:bookmarkStart w:id="117" w:name="ref-baeLeveragingMobilePhone2023"/>
+    <w:bookmarkEnd w:id="116"/>
+    <w:bookmarkStart w:id="118" w:name="ref-baeLeveragingMobilePhone2023"/>
     <w:p>
       <w:pPr>
         <w:pStyle w:val="Bibliography"/>
       </w:pPr>
       <w:r>
-        <w:t xml:space="preserve">43.</w:t>
+        <w:t xml:space="preserve">44.</w:t>
       </w:r>
       <w:r>
         <w:t xml:space="preserve"> </w:t>
@@ -8793,7 +8923,7 @@
       <w:r>
         <w:t xml:space="preserve">. JMIR formative research. 2023. doi:</w:t>
       </w:r>
-      <w:hyperlink r:id="rId116">
+      <w:hyperlink r:id="rId117">
         <w:r>
           <w:rPr>
             <w:rStyle w:val="Hyperlink"/>
@@ -8802,9 +8932,9 @@
         </w:r>
       </w:hyperlink>
     </w:p>
-    <w:bookmarkEnd w:id="117"/>
     <w:bookmarkEnd w:id="118"/>
     <w:bookmarkEnd w:id="119"/>
+    <w:bookmarkEnd w:id="120"/>
     <w:sectPr>
       <w:footnotePr>
         <w:numRestart w:val="eachSect"/>

</xml_diff>

<commit_message>
updated reviewer comments and manuscript
</commit_message>
<xml_diff>
--- a/_manuscript/index.docx
+++ b/_manuscript/index.docx
@@ -6465,7 +6465,16 @@
         <w:pStyle w:val="FirstParagraph"/>
       </w:pPr>
       <w:r>
-        <w:t xml:space="preserve">Our full model achieved fair performance, with an auROC of 0.67, indicating that some predictive signal was present. However, it did not offer incremental value beyond a baseline model that included only baseline self-report measures. Consistent with this, the four most important predictors in our model were all self-report variables: abstinence confidence, abstinence goal, negative affect efficacy, and craving.</w:t>
+        <w:t xml:space="preserve">Our full model achieved fair performance, with an auROC of 0.67, indicating that some predictive signal was present. However, it did not offer incremental value beyond a baseline model that included only baseline self-report measures. Consistent with this, the four most important predictors in our model were all self-report variables: abstinence confidence, abstinence goal, negative affect efficacy, and craving. Only baseline features related to alcohol use characteristics were retained in the full model, reinforcing that self-reported alcohol-related and recovery constructs are strong predictors of future lapse risk</w:t>
+      </w:r>
+      <w:r>
+        <w:t xml:space="preserve"> </w:t>
+      </w:r>
+      <w:r>
+        <w:t xml:space="preserve">[4,5]</w:t>
+      </w:r>
+      <w:r>
+        <w:t xml:space="preserve">.</w:t>
       </w:r>
     </w:p>
     <w:p>
@@ -6473,7 +6482,7 @@
         <w:pStyle w:val="BodyText"/>
       </w:pPr>
       <w:r>
-        <w:t xml:space="preserve">Cellular communication data on its own performed poorly for prediction (auROC = 0.67) However, it still performed above what we would expect from a model performing at chance, suggesting there may be some signal in this data. Additionally, several communication features were retained in the final model with moderately sized coefficients. These included communications with drinkers, non-drinkers, friends, and people unaware of the participant’s recovery goals. Number of unique contacts was also retained in the model, though with a much smaller coefficient.</w:t>
+        <w:t xml:space="preserve">Cellular communication data on its own performed poorly for prediction (auROC = 0.67) However, it still performed above what we would expect from a model performing at chance, suggesting there may be some signal in these data. Additionally, several communication features were retained in the final model with moderately sized coefficients. These included communications with drinkers, non-drinkers, friends, and people unaware of the participant’s recovery goals. Number of unique contacts was also retained in the model, though with a much smaller coefficient. Given that cellular communication usage may vary widely across demographic characteristics, psychiatric states, personality profiles, and alcohol use severity, we were surprised to find that these features did not appear to substantially interact with the baseline self-report measures. The elastic net algorithm outperformed the tree-based models, suggesting the relationship between features are primarily additive as opposed to interactive.</w:t>
       </w:r>
     </w:p>
     <w:p>
@@ -6481,7 +6490,7 @@
         <w:pStyle w:val="BodyText"/>
       </w:pPr>
       <w:r>
-        <w:t xml:space="preserve">The finding that communications with drinkers increase lapse risk and communications with non-drinkers decrease lapse risk is consistent with prior literature</w:t>
+        <w:t xml:space="preserve">The finding that communications with drinkers increased lapse risk and communications with non-drinkers decreased lapse risk is consistent with prior literature</w:t>
       </w:r>
       <w:r>
         <w:t xml:space="preserve"> </w:t>
@@ -6490,7 +6499,7 @@
         <w:t xml:space="preserve">[19,20]</w:t>
       </w:r>
       <w:r>
-        <w:t xml:space="preserve">. Individuals who surround themselves with people who drink (and who may have even drunk with the individual in the past) may be more likely to experience exposure to drinking-related cues and opportunities to drink. Conversely, communicating with non-drinkers may reflect a more supportive social environment that promotes recovery. Additionally, given that alcohol use is often a social activity, it is not unexpected that increased communication with friends was associated with greater lapse risk.</w:t>
+        <w:t xml:space="preserve">. Individuals who surround themselves with people who drink (and who may have even drunk with the individual in the past) may be more likely to experience exposure to drinking-related cues and opportunities to drink. Conversely, communicating with non-drinkers may reflect a more supportive social environment that promotes recovery. Additionally, given that alcohol use is often a social activity, it is not unexpected that increased communication with friends increased lapse risk.</w:t>
       </w:r>
     </w:p>
     <w:p>
@@ -6498,7 +6507,7 @@
         <w:pStyle w:val="BodyText"/>
       </w:pPr>
       <w:r>
-        <w:t xml:space="preserve">We were surprised to find that communications with people who did not know about an individual’s recovery goals was also a risk factor. We might have expected that communication with people supportive of recovery goals would be a protective factor, or that communication with people unsupportive of those goals would increase risk. One possible explanation is that lack of disclosure reflects lower confidence in sharing something as personal as recovery with others. It could also reflect perceived or anticipated stigma, thereby capturing the other person’s beliefs or attitudes about substance use. Lastly, it could signal reduced access to recovery support, as individuals cannot provide support for goals they are unaware of. Future research could explore this finding further to better understand the mechanisms underlying this association.</w:t>
+        <w:t xml:space="preserve">We were surprised to find that communications with people who did not know about an individual’s recovery goals was also a risk factor. We expected it was more likely that communication with people supportive of recovery goals would emerge as a protective factor or that communication with people unsupportive of those goals would emerge as a risk factor. One possible explanation is that a lack of disclosure about being in recovery reflects low levels of trust, making it difficult to confide in others about something so personal. It could also reflect perceived or anticipated stigma, thereby capturing the other person’s beliefs or attitudes about substance use. Lastly, it could signal reduced access to recovery support, as individuals cannot provide support for goals they are unaware of. Future research could explore this finding further to better understand the mechanisms underlying this association.</w:t>
       </w:r>
     </w:p>
     <w:p>
@@ -6523,7 +6532,7 @@
         <w:t xml:space="preserve">[41]</w:t>
       </w:r>
       <w:r>
-        <w:t xml:space="preserve">. Therefore, our dataset likely missed a substantial portion of participants’ communications. Future studies could explore whether incorporating communication data from additional platforms yields stronger predictive signal. It may be also worthwhile to use scoring epochs longer than one week. Longer scoring epochs (e.g., two weeks or one month) would contain more data. Additionally, they may better capture slow evolving risk-features, such as a gradually shrinking social circle leading to improved predictive performance. However, even with improved data collection methods, sparsity may remain a challenge, as some people may simply not communicate frequently with others and others use services (e.g., Snapchat) that automatically delete messages.</w:t>
+        <w:t xml:space="preserve">. Therefore, our dataset likely missed a substantial portion of participants’ communications. Future studies could explore whether incorporating communication data from additional platforms yields stronger predictive signal. It may be also worthwhile to use scoring epochs longer than one week. Longer scoring epochs (e.g., two weeks or one month) would contain more data. Additionally, they may better capture slow evolving risk-features, such as a gradually shrinking social circle, leading to improved predictive performance. However, even with improved data collection methods, sparsity may remain a challenge, as some people may simply not communicate frequently with others and others use services (e.g., Snapchat) that automatically delete messages.</w:t>
       </w:r>
     </w:p>
     <w:p>
@@ -6531,7 +6540,7 @@
         <w:pStyle w:val="BodyText"/>
       </w:pPr>
       <w:r>
-        <w:t xml:space="preserve">We also cannot eliminate the possibility that our participants were purposefully deleting text messages and call logs that they did not want us to see. This may be especially relevant for text messages (e.g., where drinking plans were made). Although the focus of this study was on the metadata and context of cellular communications, text message content, nevertheless, was collected during the cellular communication log download as party of the larger aims of the parent project. This raises the possibility of missed opportunity for risk-relevant signal due to non-random patterns of missing data (i.e., data missingness increases when participants lapse).</w:t>
+        <w:t xml:space="preserve">We also cannot eliminate the possibility that our participants were purposefully deleting text messages and call logs that they did not want us to see. This may be especially relevant for text messages (e.g., where drinking plans were made). Although the focus of this study was on the metadata and context of cellular communications, text message content, nevertheless, was collected during the cellular communication log download as part of the larger aims of the parent project. This raises the possibility of missed opportunity for capturing risk-relevant signal due to non-random patterns of missing data (e.g., when data missingness systematically increases during periods of lapse).</w:t>
       </w:r>
     </w:p>
     <w:p>
@@ -6539,7 +6548,7 @@
         <w:pStyle w:val="BodyText"/>
       </w:pPr>
       <w:r>
-        <w:t xml:space="preserve">Our conclusions are limited by sample composition and size. Our participants were predominantly non-Hispanic White and all were from the Madison, WI area. We had poor representation of older adults (65+ years) which may have been due to our requirement that participants owned and used a smartphone. Smartphone ownership is generally high. As of 2025, roughly 91% of Americans own a smartphone, with at least 85% ownership across across gender, race/ethnicity, socioeconomic status, and geographic location subgroups</w:t>
+        <w:t xml:space="preserve">Our conclusions are limited by sample composition and size. Our participants were predominantly non-Hispanic White and all were from the Madison, Wisconsin area. We had poor representation of older adults (65+ years) which may have been due to our requirement that participants owned and used a smartphone. Smartphone ownership is generally high. As of 2025, roughly 91% of Americans own a smartphone, with at least 85% ownership across across gender, race/ethnicity, socioeconomic status, and geographic location subgroups</w:t>
       </w:r>
       <w:r>
         <w:t xml:space="preserve"> </w:t>
@@ -6548,7 +6557,7 @@
         <w:t xml:space="preserve">[42]</w:t>
       </w:r>
       <w:r>
-        <w:t xml:space="preserve">. One exception to this pattern is with older adults. Ownership rates dip down to 78% among those ages 65 and older</w:t>
+        <w:t xml:space="preserve">. One exception to this pattern is with older adults. Ownership rates dip down to 78% among those age 65 years and older</w:t>
       </w:r>
       <w:r>
         <w:t xml:space="preserve"> </w:t>
@@ -6557,7 +6566,15 @@
         <w:t xml:space="preserve">[42]</w:t>
       </w:r>
       <w:r>
-        <w:t xml:space="preserve">. On top of a relatively homogeneous sample composition, our sample size was relatively small (</w:t>
+        <w:t xml:space="preserve">.</w:t>
+      </w:r>
+    </w:p>
+    <w:p>
+      <w:pPr>
+        <w:pStyle w:val="BodyText"/>
+      </w:pPr>
+      <w:r>
+        <w:t xml:space="preserve">In addition to a mostly homogeneous sample composition, our sample size was relatively small (</w:t>
       </w:r>
       <m:oMath>
         <m:r>
@@ -6565,7 +6582,7 @@
         </m:r>
       </m:oMath>
       <w:r>
-        <w:t xml:space="preserve">=144). Our large number of observations (i.e., 11,507 prediction windows across participants) was sufficient for training machine learning models with low bias and variance and evaluating model performance on new individuals. However, these estimates represent unbiased estimated of how well our model performs on new individuals similar in composition to those in our sample. Thus, our findings may not generalize to individuals from more diverse populations or in different geographic locations.</w:t>
+        <w:t xml:space="preserve">=144). Although the large number of observations (11,507 prediction windows across participants) was sufficient for training machine learning models with low bias and variance, model evaluation was conducted on a limited subset of new individuals. As a result, these estimates reflect expected performance on individuals similar in composition to those in our sample. Thus, findings may not generalize to more diverse populations or to individuals in different geographic contexts.</w:t>
       </w:r>
     </w:p>
     <w:p>

</xml_diff>